<commit_message>
RDA:lab5 fixed, lab6 done
</commit_message>
<xml_diff>
--- a/RDA/Labs/lab5/Критерии приёмки.docx
+++ b/RDA/Labs/lab5/Критерии приёмки.docx
@@ -1112,13 +1112,55 @@
         </w:rPr>
         <w:tab/>
       </w:r>
-      <w:r>
-        <w:rPr>
-          <w:rFonts w:ascii="Times New Roman" w:hAnsi="Times New Roman" w:cs="Times New Roman"/>
-          <w:sz w:val="28"/>
-          <w:szCs w:val="28"/>
-        </w:rPr>
-        <w:t>Scenario: Отображение прогресса выполнения задач</w:t>
+      <w:proofErr w:type="spellStart"/>
+      <w:r>
+        <w:rPr>
+          <w:rFonts w:ascii="Times New Roman" w:hAnsi="Times New Roman" w:cs="Times New Roman"/>
+          <w:sz w:val="28"/>
+          <w:szCs w:val="28"/>
+        </w:rPr>
+        <w:t>Scenario</w:t>
+      </w:r>
+      <w:proofErr w:type="spellEnd"/>
+      <w:r>
+        <w:rPr>
+          <w:rFonts w:ascii="Times New Roman" w:hAnsi="Times New Roman" w:cs="Times New Roman"/>
+          <w:sz w:val="28"/>
+          <w:szCs w:val="28"/>
+        </w:rPr>
+        <w:t>: Отображение прогресса выполнения</w:t>
+      </w:r>
+      <w:r>
+        <w:rPr>
+          <w:rFonts w:ascii="Times New Roman" w:hAnsi="Times New Roman" w:cs="Times New Roman"/>
+          <w:sz w:val="28"/>
+          <w:szCs w:val="28"/>
+        </w:rPr>
+        <w:t xml:space="preserve"> </w:t>
+      </w:r>
+      <w:r>
+        <w:rPr>
+          <w:rFonts w:ascii="Times New Roman" w:hAnsi="Times New Roman" w:cs="Times New Roman"/>
+          <w:sz w:val="28"/>
+          <w:szCs w:val="28"/>
+        </w:rPr>
+        <w:t>и</w:t>
+      </w:r>
+      <w:r>
+        <w:rPr>
+          <w:rFonts w:ascii="Times New Roman" w:hAnsi="Times New Roman" w:cs="Times New Roman"/>
+          <w:sz w:val="28"/>
+          <w:szCs w:val="28"/>
+        </w:rPr>
+        <w:tab/>
+      </w:r>
+      <w:r>
+        <w:rPr>
+          <w:rFonts w:ascii="Times New Roman" w:hAnsi="Times New Roman" w:cs="Times New Roman"/>
+          <w:sz w:val="28"/>
+          <w:szCs w:val="28"/>
+        </w:rPr>
+        <w:t xml:space="preserve"> задач</w:t>
       </w:r>
     </w:p>
     <w:p>
@@ -1131,13 +1173,23 @@
           <w:szCs w:val="28"/>
         </w:rPr>
       </w:pPr>
-      <w:r>
-        <w:rPr>
-          <w:rFonts w:ascii="Times New Roman" w:hAnsi="Times New Roman" w:cs="Times New Roman"/>
-          <w:sz w:val="28"/>
-          <w:szCs w:val="28"/>
-        </w:rPr>
-        <w:t>Given пользователь находится на главной странице системы</w:t>
+      <w:proofErr w:type="spellStart"/>
+      <w:r>
+        <w:rPr>
+          <w:rFonts w:ascii="Times New Roman" w:hAnsi="Times New Roman" w:cs="Times New Roman"/>
+          <w:sz w:val="28"/>
+          <w:szCs w:val="28"/>
+        </w:rPr>
+        <w:t>Given</w:t>
+      </w:r>
+      <w:proofErr w:type="spellEnd"/>
+      <w:r>
+        <w:rPr>
+          <w:rFonts w:ascii="Times New Roman" w:hAnsi="Times New Roman" w:cs="Times New Roman"/>
+          <w:sz w:val="28"/>
+          <w:szCs w:val="28"/>
+        </w:rPr>
+        <w:t xml:space="preserve"> пользователь находится на главной странице системы</w:t>
       </w:r>
     </w:p>
     <w:p>
@@ -1150,13 +1202,23 @@
           <w:szCs w:val="28"/>
         </w:rPr>
       </w:pPr>
-      <w:r>
-        <w:rPr>
-          <w:rFonts w:ascii="Times New Roman" w:hAnsi="Times New Roman" w:cs="Times New Roman"/>
-          <w:sz w:val="28"/>
-          <w:szCs w:val="28"/>
-        </w:rPr>
-        <w:t>When система загружает список задач пользователя</w:t>
+      <w:proofErr w:type="spellStart"/>
+      <w:r>
+        <w:rPr>
+          <w:rFonts w:ascii="Times New Roman" w:hAnsi="Times New Roman" w:cs="Times New Roman"/>
+          <w:sz w:val="28"/>
+          <w:szCs w:val="28"/>
+        </w:rPr>
+        <w:t>When</w:t>
+      </w:r>
+      <w:proofErr w:type="spellEnd"/>
+      <w:r>
+        <w:rPr>
+          <w:rFonts w:ascii="Times New Roman" w:hAnsi="Times New Roman" w:cs="Times New Roman"/>
+          <w:sz w:val="28"/>
+          <w:szCs w:val="28"/>
+        </w:rPr>
+        <w:t xml:space="preserve"> система загружает список задач пользователя</w:t>
       </w:r>
     </w:p>
     <w:p>
@@ -1169,13 +1231,23 @@
           <w:szCs w:val="28"/>
         </w:rPr>
       </w:pPr>
-      <w:r>
-        <w:rPr>
-          <w:rFonts w:ascii="Times New Roman" w:hAnsi="Times New Roman" w:cs="Times New Roman"/>
-          <w:sz w:val="28"/>
-          <w:szCs w:val="28"/>
-        </w:rPr>
-        <w:t>Then отображается:</w:t>
+      <w:proofErr w:type="spellStart"/>
+      <w:r>
+        <w:rPr>
+          <w:rFonts w:ascii="Times New Roman" w:hAnsi="Times New Roman" w:cs="Times New Roman"/>
+          <w:sz w:val="28"/>
+          <w:szCs w:val="28"/>
+        </w:rPr>
+        <w:t>Then</w:t>
+      </w:r>
+      <w:proofErr w:type="spellEnd"/>
+      <w:r>
+        <w:rPr>
+          <w:rFonts w:ascii="Times New Roman" w:hAnsi="Times New Roman" w:cs="Times New Roman"/>
+          <w:sz w:val="28"/>
+          <w:szCs w:val="28"/>
+        </w:rPr>
+        <w:t xml:space="preserve"> отображается:</w:t>
       </w:r>
     </w:p>
     <w:p>
@@ -1210,13 +1282,6 @@
           <w:szCs w:val="28"/>
         </w:rPr>
         <w:tab/>
-      </w:r>
-      <w:r>
-        <w:rPr>
-          <w:rFonts w:ascii="Times New Roman" w:hAnsi="Times New Roman" w:cs="Times New Roman"/>
-          <w:sz w:val="28"/>
-          <w:szCs w:val="28"/>
-        </w:rPr>
         <w:t xml:space="preserve"> - </w:t>
       </w:r>
       <w:r>
@@ -1260,13 +1325,6 @@
           <w:szCs w:val="28"/>
         </w:rPr>
         <w:tab/>
-      </w:r>
-      <w:r>
-        <w:rPr>
-          <w:rFonts w:ascii="Times New Roman" w:hAnsi="Times New Roman" w:cs="Times New Roman"/>
-          <w:sz w:val="28"/>
-          <w:szCs w:val="28"/>
-        </w:rPr>
         <w:t xml:space="preserve"> - количество выполненных задач</w:t>
       </w:r>
     </w:p>
@@ -1302,13 +1360,6 @@
           <w:szCs w:val="28"/>
         </w:rPr>
         <w:tab/>
-      </w:r>
-      <w:r>
-        <w:rPr>
-          <w:rFonts w:ascii="Times New Roman" w:hAnsi="Times New Roman" w:cs="Times New Roman"/>
-          <w:sz w:val="28"/>
-          <w:szCs w:val="28"/>
-        </w:rPr>
         <w:t>- прогресс-бар с процентом выполнения</w:t>
       </w:r>
     </w:p>
@@ -1344,13 +1395,6 @@
           <w:szCs w:val="28"/>
         </w:rPr>
         <w:tab/>
-      </w:r>
-      <w:r>
-        <w:rPr>
-          <w:rFonts w:ascii="Times New Roman" w:hAnsi="Times New Roman" w:cs="Times New Roman"/>
-          <w:sz w:val="28"/>
-          <w:szCs w:val="28"/>
-        </w:rPr>
         <w:t xml:space="preserve"> - актуальные данные обновляются автоматически</w:t>
       </w:r>
     </w:p>

</xml_diff>

<commit_message>
RDA:lab5 and 6 minor fixes
</commit_message>
<xml_diff>
--- a/RDA/Labs/lab5/Критерии приёмки.docx
+++ b/RDA/Labs/lab5/Критерии приёмки.docx
@@ -1112,23 +1112,13 @@
         </w:rPr>
         <w:tab/>
       </w:r>
-      <w:proofErr w:type="spellStart"/>
-      <w:r>
-        <w:rPr>
-          <w:rFonts w:ascii="Times New Roman" w:hAnsi="Times New Roman" w:cs="Times New Roman"/>
-          <w:sz w:val="28"/>
-          <w:szCs w:val="28"/>
-        </w:rPr>
-        <w:t>Scenario</w:t>
-      </w:r>
-      <w:proofErr w:type="spellEnd"/>
-      <w:r>
-        <w:rPr>
-          <w:rFonts w:ascii="Times New Roman" w:hAnsi="Times New Roman" w:cs="Times New Roman"/>
-          <w:sz w:val="28"/>
-          <w:szCs w:val="28"/>
-        </w:rPr>
-        <w:t>: Отображение прогресса выполнения</w:t>
+      <w:r>
+        <w:rPr>
+          <w:rFonts w:ascii="Times New Roman" w:hAnsi="Times New Roman" w:cs="Times New Roman"/>
+          <w:sz w:val="28"/>
+          <w:szCs w:val="28"/>
+        </w:rPr>
+        <w:t>Scenario: Отображение прогресса выполнения</w:t>
       </w:r>
       <w:r>
         <w:rPr>
@@ -1152,14 +1142,6 @@
           <w:sz w:val="28"/>
           <w:szCs w:val="28"/>
         </w:rPr>
-        <w:tab/>
-      </w:r>
-      <w:r>
-        <w:rPr>
-          <w:rFonts w:ascii="Times New Roman" w:hAnsi="Times New Roman" w:cs="Times New Roman"/>
-          <w:sz w:val="28"/>
-          <w:szCs w:val="28"/>
-        </w:rPr>
         <w:t xml:space="preserve"> задач</w:t>
       </w:r>
     </w:p>
@@ -1173,23 +1155,13 @@
           <w:szCs w:val="28"/>
         </w:rPr>
       </w:pPr>
-      <w:proofErr w:type="spellStart"/>
-      <w:r>
-        <w:rPr>
-          <w:rFonts w:ascii="Times New Roman" w:hAnsi="Times New Roman" w:cs="Times New Roman"/>
-          <w:sz w:val="28"/>
-          <w:szCs w:val="28"/>
-        </w:rPr>
-        <w:t>Given</w:t>
-      </w:r>
-      <w:proofErr w:type="spellEnd"/>
-      <w:r>
-        <w:rPr>
-          <w:rFonts w:ascii="Times New Roman" w:hAnsi="Times New Roman" w:cs="Times New Roman"/>
-          <w:sz w:val="28"/>
-          <w:szCs w:val="28"/>
-        </w:rPr>
-        <w:t xml:space="preserve"> пользователь находится на главной странице системы</w:t>
+      <w:r>
+        <w:rPr>
+          <w:rFonts w:ascii="Times New Roman" w:hAnsi="Times New Roman" w:cs="Times New Roman"/>
+          <w:sz w:val="28"/>
+          <w:szCs w:val="28"/>
+        </w:rPr>
+        <w:t>Given пользователь находится на главной странице системы</w:t>
       </w:r>
     </w:p>
     <w:p>
@@ -1202,23 +1174,13 @@
           <w:szCs w:val="28"/>
         </w:rPr>
       </w:pPr>
-      <w:proofErr w:type="spellStart"/>
-      <w:r>
-        <w:rPr>
-          <w:rFonts w:ascii="Times New Roman" w:hAnsi="Times New Roman" w:cs="Times New Roman"/>
-          <w:sz w:val="28"/>
-          <w:szCs w:val="28"/>
-        </w:rPr>
-        <w:t>When</w:t>
-      </w:r>
-      <w:proofErr w:type="spellEnd"/>
-      <w:r>
-        <w:rPr>
-          <w:rFonts w:ascii="Times New Roman" w:hAnsi="Times New Roman" w:cs="Times New Roman"/>
-          <w:sz w:val="28"/>
-          <w:szCs w:val="28"/>
-        </w:rPr>
-        <w:t xml:space="preserve"> система загружает список задач пользователя</w:t>
+      <w:r>
+        <w:rPr>
+          <w:rFonts w:ascii="Times New Roman" w:hAnsi="Times New Roman" w:cs="Times New Roman"/>
+          <w:sz w:val="28"/>
+          <w:szCs w:val="28"/>
+        </w:rPr>
+        <w:t>When система загружает список задач пользователя</w:t>
       </w:r>
     </w:p>
     <w:p>
@@ -1231,23 +1193,13 @@
           <w:szCs w:val="28"/>
         </w:rPr>
       </w:pPr>
-      <w:proofErr w:type="spellStart"/>
-      <w:r>
-        <w:rPr>
-          <w:rFonts w:ascii="Times New Roman" w:hAnsi="Times New Roman" w:cs="Times New Roman"/>
-          <w:sz w:val="28"/>
-          <w:szCs w:val="28"/>
-        </w:rPr>
-        <w:t>Then</w:t>
-      </w:r>
-      <w:proofErr w:type="spellEnd"/>
-      <w:r>
-        <w:rPr>
-          <w:rFonts w:ascii="Times New Roman" w:hAnsi="Times New Roman" w:cs="Times New Roman"/>
-          <w:sz w:val="28"/>
-          <w:szCs w:val="28"/>
-        </w:rPr>
-        <w:t xml:space="preserve"> отображается:</w:t>
+      <w:r>
+        <w:rPr>
+          <w:rFonts w:ascii="Times New Roman" w:hAnsi="Times New Roman" w:cs="Times New Roman"/>
+          <w:sz w:val="28"/>
+          <w:szCs w:val="28"/>
+        </w:rPr>
+        <w:t>Then отображается:</w:t>
       </w:r>
     </w:p>
     <w:p>

</xml_diff>